<commit_message>
Finalize evaluation and submission documentation
</commit_message>
<xml_diff>
--- a/Final Report.docx
+++ b/Final Report.docx
@@ -83,10 +83,16 @@
       <w:r>
         <w:t>The source data is the Kaggle Customer Support on Twitter dataset (twcs.csv). Spotify support interactions were extracted and converted into customer-to-Spotify support cases with bounded conversation context. The resulting retrieval corpus is results/spotify_cases.csv.</w:t>
       </w:r>
+      <w:r>
+        <w:t xml:space="preserve"> Source: Kaggle, Customer Support on Twitter dataset (twcs.csv).</w:t>
+      </w:r>
     </w:p>
     <w:p>
       <w:r>
         <w:t>A 200-example Spotify sample was manually labelled using nine intent categories: PLAYBACK_OR_APP_ISSUE, SUBSCRIPTION_OR_PAYMENT, ACCOUNT, FEATURE_OR_UI, CONTENT_OR_CATALOG, PROMOTION_OR_EVENT, PRIVACY_OR_DATA, SUPPORT_CHANNEL_OR_LANGUAGE, and OTHER.</w:t>
+      </w:r>
+      <w:r>
+        <w:t xml:space="preserve"> The annotation work was completed in batches and merged into the final gold annotation set before the development/test split. The resulting 200 cases were then divided into development and held-out test data.</w:t>
       </w:r>
     </w:p>
     <w:p>
@@ -181,21 +187,18 @@
     <w:tbl>
       <w:tblPr>
         <w:tblStyle w:val="TableGrid"/>
-        <w:tblW w:w="0" w:type="auto"/>
-        <w:jc w:val="center"/>
-        <w:tblLook w:val="04A0" w:firstRow="1" w:lastRow="0" w:firstColumn="1" w:lastColumn="0" w:noHBand="0" w:noVBand="1"/>
+        <w:tblW w:type="auto" w:w="0"/>
+        <w:tblLook w:firstColumn="1" w:firstRow="1" w:lastColumn="0" w:lastRow="0" w:noHBand="0" w:noVBand="1" w:val="04A0"/>
       </w:tblPr>
       <w:tblGrid>
-        <w:gridCol w:w="5184"/>
-        <w:gridCol w:w="5184"/>
+        <w:gridCol w:w="3456"/>
+        <w:gridCol w:w="3456"/>
+        <w:gridCol w:w="3456"/>
       </w:tblGrid>
       <w:tr>
-        <w:trPr>
-          <w:jc w:val="center"/>
-        </w:trPr>
         <w:tc>
           <w:tcPr>
-            <w:tcW w:w="5184" w:type="dxa"/>
+            <w:tcW w:type="dxa" w:w="3456"/>
           </w:tcPr>
           <w:p>
             <w:r>
@@ -205,7 +208,17 @@
         </w:tc>
         <w:tc>
           <w:tcPr>
-            <w:tcW w:w="5184" w:type="dxa"/>
+            <w:tcW w:type="dxa" w:w="3456"/>
+          </w:tcPr>
+          <w:p>
+            <w:r>
+              <w:t>Correct / 50</w:t>
+            </w:r>
+          </w:p>
+        </w:tc>
+        <w:tc>
+          <w:tcPr>
+            <w:tcW w:type="dxa" w:w="3456"/>
           </w:tcPr>
           <w:p>
             <w:r>
@@ -215,12 +228,9 @@
         </w:tc>
       </w:tr>
       <w:tr>
-        <w:trPr>
-          <w:jc w:val="center"/>
-        </w:trPr>
         <w:tc>
           <w:tcPr>
-            <w:tcW w:w="5184" w:type="dxa"/>
+            <w:tcW w:type="dxa" w:w="3456"/>
           </w:tcPr>
           <w:p>
             <w:r>
@@ -230,22 +240,29 @@
         </w:tc>
         <w:tc>
           <w:tcPr>
-            <w:tcW w:w="5184" w:type="dxa"/>
+            <w:tcW w:type="dxa" w:w="3456"/>
           </w:tcPr>
           <w:p>
             <w:r>
-              <w:t>37.0%</w:t>
+              <w:t>19 / 50</w:t>
+            </w:r>
+          </w:p>
+        </w:tc>
+        <w:tc>
+          <w:tcPr>
+            <w:tcW w:type="dxa" w:w="3456"/>
+          </w:tcPr>
+          <w:p>
+            <w:r>
+              <w:t>38.0%</w:t>
             </w:r>
           </w:p>
         </w:tc>
       </w:tr>
       <w:tr>
-        <w:trPr>
-          <w:jc w:val="center"/>
-        </w:trPr>
         <w:tc>
           <w:tcPr>
-            <w:tcW w:w="5184" w:type="dxa"/>
+            <w:tcW w:type="dxa" w:w="3456"/>
           </w:tcPr>
           <w:p>
             <w:r>
@@ -255,22 +272,29 @@
         </w:tc>
         <w:tc>
           <w:tcPr>
-            <w:tcW w:w="5184" w:type="dxa"/>
+            <w:tcW w:type="dxa" w:w="3456"/>
           </w:tcPr>
           <w:p>
             <w:r>
-              <w:t>34.5%</w:t>
+              <w:t>18 / 50</w:t>
+            </w:r>
+          </w:p>
+        </w:tc>
+        <w:tc>
+          <w:tcPr>
+            <w:tcW w:type="dxa" w:w="3456"/>
+          </w:tcPr>
+          <w:p>
+            <w:r>
+              <w:t>36.0%</w:t>
             </w:r>
           </w:p>
         </w:tc>
       </w:tr>
       <w:tr>
-        <w:trPr>
-          <w:jc w:val="center"/>
-        </w:trPr>
         <w:tc>
           <w:tcPr>
-            <w:tcW w:w="5184" w:type="dxa"/>
+            <w:tcW w:type="dxa" w:w="3456"/>
           </w:tcPr>
           <w:p>
             <w:r>
@@ -280,7 +304,17 @@
         </w:tc>
         <w:tc>
           <w:tcPr>
-            <w:tcW w:w="5184" w:type="dxa"/>
+            <w:tcW w:type="dxa" w:w="3456"/>
+          </w:tcPr>
+          <w:p>
+            <w:r>
+              <w:t>22 / 50</w:t>
+            </w:r>
+          </w:p>
+        </w:tc>
+        <w:tc>
+          <w:tcPr>
+            <w:tcW w:type="dxa" w:w="3456"/>
           </w:tcPr>
           <w:p>
             <w:r>
@@ -290,14 +324,32 @@
         </w:tc>
       </w:tr>
     </w:tbl>
+    <w:p/>
     <w:p>
       <w:r>
         <w:t>The final agent correctly classified 22 of 50 held-out cases (44.0%). This is the official final intent-classification result.</w:t>
       </w:r>
     </w:p>
     <w:p>
+      <w:pPr>
+        <w:spacing w:after="200"/>
+      </w:pPr>
       <w:r>
-        <w:t>The 44.0% result should not be interpreted as a general estimate of real-world customer-support accuracy. It is the observed accuracy on this specific 50-case held-out sample. The test set is intentionally small, and several intent categories have very few examples. The result is therefore most useful as an internal benchmark for this pipeline and for comparison with the included baselines.</w:t>
+        <w:br w:type="page"/>
+      </w:r>
+    </w:p>
+    <w:p>
+      <w:pPr>
+        <w:pStyle w:val="Heading2"/>
+      </w:pPr>
+      <w:r>
+        <w:lastRenderedPageBreak/>
+        <w:t>What is misleading about my headline number?</w:t>
+      </w:r>
+    </w:p>
+    <w:p>
+      <w:r>
+        <w:t>The headline result of 44.0% can sound like a general estimate of customer-support intent accuracy, but it is only the observed accuracy on this specific 50-case held-out sample. The dataset is small, several intent categories have few examples, and the sample is not intended to represent all Spotify customer-support traffic. Therefore, the result should be interpreted as a benchmark for this particular pipeline and test set, not as a general population accuracy estimate.</w:t>
       </w:r>
     </w:p>
     <w:p>
@@ -305,53 +357,143 @@
         <w:pStyle w:val="Heading1"/>
       </w:pPr>
       <w:r>
-        <w:lastRenderedPageBreak/>
         <w:t>5. Failure Analysis</w:t>
       </w:r>
     </w:p>
     <w:p>
       <w:pPr>
-        <w:pStyle w:val="ListBullet"/>
+        <w:spacing w:after="60"/>
       </w:pPr>
       <w:r>
-        <w:t>Short contextual messages are difficult to classify without sufficient context.</w:t>
+        <w:t>The final 50-case evaluation identified five recurring failure modes.</w:t>
       </w:r>
     </w:p>
     <w:p>
       <w:pPr>
-        <w:pStyle w:val="ListBullet"/>
+        <w:spacing w:after="60"/>
       </w:pPr>
       <w:r>
-        <w:t>FEATURE_OR_UI and CONTENT_OR_CATALOG are frequently confused.</w:t>
+        <w:t>1. Context-dependent short messages</w:t>
       </w:r>
     </w:p>
     <w:p>
       <w:pPr>
-        <w:pStyle w:val="ListBullet"/>
+        <w:spacing w:after="60"/>
       </w:pPr>
       <w:r>
-        <w:t>Technical-looking messages can be over-predicted as PLAYBACK_OR_APP_ISSUE.</w:t>
+        <w:t>Examples include Case 4 ("Okay. Thankyou."), Case 70 ("Ok, thanks."), and Case 137 ("Thank you"), which were predicted as OTHER despite having specific gold intents.</w:t>
       </w:r>
     </w:p>
     <w:p>
       <w:pPr>
-        <w:pStyle w:val="ListBullet"/>
+        <w:spacing w:after="60"/>
       </w:pPr>
       <w:r>
-        <w:t>Sparse messages can produce weak retrieval evidence.</w:t>
+        <w:t>Hypothesis: These messages contain little standalone semantic information, so correct classification depends heavily on preceding conversation context.</w:t>
       </w:r>
     </w:p>
     <w:p>
       <w:pPr>
-        <w:pStyle w:val="ListBullet"/>
+        <w:spacing w:after="60"/>
       </w:pPr>
       <w:r>
-        <w:t>Retrieved examples can sometimes influence the response too strongly when they are only approximately similar.</w:t>
+        <w:t>2. FEATURE_OR_UI vs CONTENT_OR_CATALOG ambiguity</w:t>
       </w:r>
     </w:p>
     <w:p>
+      <w:pPr>
+        <w:spacing w:after="60"/>
+      </w:pPr>
       <w:r>
-        <w:t>The analysis was performed after the final test run. The findings are documented as limitations rather than used to repeatedly tune the held-out test set.</w:t>
+        <w:t>Cases 71, 96, and 165 demonstrate confusion between these categories.</w:t>
+      </w:r>
+    </w:p>
+    <w:p>
+      <w:pPr>
+        <w:spacing w:after="60"/>
+      </w:pPr>
+      <w:r>
+        <w:t>Hypothesis: The taxonomy contains overlapping cases where device information, application behavior, and content-access issues are difficult to distinguish from the message alone.</w:t>
+      </w:r>
+    </w:p>
+    <w:p>
+      <w:pPr>
+        <w:spacing w:after="60"/>
+      </w:pPr>
+      <w:r>
+        <w:t>3. Technical/device language over-predicted as PLAYBACK_OR_APP_ISSUE</w:t>
+      </w:r>
+    </w:p>
+    <w:p>
+      <w:pPr>
+        <w:spacing w:after="60"/>
+      </w:pPr>
+      <w:r>
+        <w:t>Cases 3, 107, and 194 were classified as PLAYBACK_OR_APP_ISSUE despite different gold intents.</w:t>
+      </w:r>
+    </w:p>
+    <w:p>
+      <w:pPr>
+        <w:spacing w:after="60"/>
+      </w:pPr>
+      <w:r>
+        <w:t>Hypothesis: Device, operating-system, application, and network vocabulary resembles historical playback/app troubleshooting examples.</w:t>
+      </w:r>
+    </w:p>
+    <w:p>
+      <w:pPr>
+        <w:spacing w:after="60"/>
+      </w:pPr>
+      <w:r>
+        <w:t>4. Sparse inputs produce weak retrieval evidence</w:t>
+      </w:r>
+    </w:p>
+    <w:p>
+      <w:pPr>
+        <w:spacing w:after="60"/>
+      </w:pPr>
+      <w:r>
+        <w:t>Incorrect cases included top retrieval similarities of 0.094 (Case 12), 0.132 (Case 107), 0.138 (Case 63), 0.152 (Case 166), and 0.169 (Case 87).</w:t>
+      </w:r>
+    </w:p>
+    <w:p>
+      <w:pPr>
+        <w:spacing w:after="60"/>
+      </w:pPr>
+      <w:r>
+        <w:t>Hypothesis: TF-IDF depends on lexical overlap, so short or unusually phrased messages provide weak retrieval evidence.</w:t>
+      </w:r>
+    </w:p>
+    <w:p>
+      <w:pPr>
+        <w:spacing w:after="60"/>
+      </w:pPr>
+      <w:r>
+        <w:t>5. Retrieved examples can pull responses toward an incorrect topic</w:t>
+      </w:r>
+    </w:p>
+    <w:p>
+      <w:pPr>
+        <w:spacing w:after="60"/>
+      </w:pPr>
+      <w:r>
+        <w:t>For example, Case 96 produced a response about a Stranger Things Easter Egg even though the customer only provided iPhone/iOS and Premium information.</w:t>
+      </w:r>
+    </w:p>
+    <w:p>
+      <w:pPr>
+        <w:spacing w:after="60"/>
+      </w:pPr>
+      <w:r>
+        <w:t>Hypothesis: When the current message is ambiguous, the LLM can over-weight an approximately similar retrieved example and treat its topic as the customer's actual problem.</w:t>
+      </w:r>
+    </w:p>
+    <w:p>
+      <w:pPr>
+        <w:spacing w:after="60"/>
+      </w:pPr>
+      <w:r>
+        <w:t>These findings were analyzed after the final test run and were not used for repeated tuning against the held-out test set.</w:t>
       </w:r>
     </w:p>
     <w:p>
@@ -363,150 +505,75 @@
       </w:r>
     </w:p>
     <w:p>
+      <w:pPr>
+        <w:spacing w:after="60"/>
+      </w:pPr>
       <w:r>
-        <w:t>Reply quality was evaluated separately from intent classification. A fixed sample of 40 cases was selected from the existing 50 generated test outputs. Human ratings used five criteria—correctness, relevance, grounding, actionability, and communication—plus an overall score, each on a 1–5 scale.</w:t>
+        <w:t>Reply quality was evaluated separately from intent classification. A fixed sample of 40 cases was selected from the existing 50 generated test outputs.</w:t>
       </w:r>
     </w:p>
-    <w:tbl>
-      <w:tblPr>
-        <w:tblStyle w:val="TableGrid"/>
-        <w:tblW w:w="0" w:type="auto"/>
-        <w:jc w:val="center"/>
-        <w:tblLook w:val="04A0" w:firstRow="1" w:lastRow="0" w:firstColumn="1" w:lastColumn="0" w:noHBand="0" w:noVBand="1"/>
-      </w:tblPr>
-      <w:tblGrid>
-        <w:gridCol w:w="5184"/>
-        <w:gridCol w:w="5184"/>
-      </w:tblGrid>
-      <w:tr>
-        <w:trPr>
-          <w:jc w:val="center"/>
-        </w:trPr>
-        <w:tc>
-          <w:tcPr>
-            <w:tcW w:w="5184" w:type="dxa"/>
-          </w:tcPr>
-          <w:p>
-            <w:r>
-              <w:t>Measure</w:t>
-            </w:r>
-          </w:p>
-        </w:tc>
-        <w:tc>
-          <w:tcPr>
-            <w:tcW w:w="5184" w:type="dxa"/>
-          </w:tcPr>
-          <w:p>
-            <w:r>
-              <w:t>Result</w:t>
-            </w:r>
-          </w:p>
-        </w:tc>
-      </w:tr>
-      <w:tr>
-        <w:trPr>
-          <w:jc w:val="center"/>
-        </w:trPr>
-        <w:tc>
-          <w:tcPr>
-            <w:tcW w:w="5184" w:type="dxa"/>
-          </w:tcPr>
-          <w:p>
-            <w:r>
-              <w:t>Human overall mean</w:t>
-            </w:r>
-          </w:p>
-        </w:tc>
-        <w:tc>
-          <w:tcPr>
-            <w:tcW w:w="5184" w:type="dxa"/>
-          </w:tcPr>
-          <w:p>
-            <w:r>
-              <w:t>4.175 / 5</w:t>
-            </w:r>
-          </w:p>
-        </w:tc>
-      </w:tr>
-      <w:tr>
-        <w:trPr>
-          <w:jc w:val="center"/>
-        </w:trPr>
-        <w:tc>
-          <w:tcPr>
-            <w:tcW w:w="5184" w:type="dxa"/>
-          </w:tcPr>
-          <w:p>
-            <w:r>
-              <w:t>LLM judge overall mean</w:t>
-            </w:r>
-          </w:p>
-        </w:tc>
-        <w:tc>
-          <w:tcPr>
-            <w:tcW w:w="5184" w:type="dxa"/>
-          </w:tcPr>
-          <w:p>
-            <w:r>
-              <w:t>4.150 / 5</w:t>
-            </w:r>
-          </w:p>
-        </w:tc>
-      </w:tr>
-      <w:tr>
-        <w:trPr>
-          <w:jc w:val="center"/>
-        </w:trPr>
-        <w:tc>
-          <w:tcPr>
-            <w:tcW w:w="5184" w:type="dxa"/>
-          </w:tcPr>
-          <w:p>
-            <w:r>
-              <w:t>Overall exact human-vs-LLM agreement</w:t>
-            </w:r>
-          </w:p>
-        </w:tc>
-        <w:tc>
-          <w:tcPr>
-            <w:tcW w:w="5184" w:type="dxa"/>
-          </w:tcPr>
-          <w:p>
-            <w:r>
-              <w:t>42.5%</w:t>
-            </w:r>
-          </w:p>
-        </w:tc>
-      </w:tr>
-      <w:tr>
-        <w:trPr>
-          <w:jc w:val="center"/>
-        </w:trPr>
-        <w:tc>
-          <w:tcPr>
-            <w:tcW w:w="5184" w:type="dxa"/>
-          </w:tcPr>
-          <w:p>
-            <w:r>
-              <w:t>Overall agreement within one rating point</w:t>
-            </w:r>
-          </w:p>
-        </w:tc>
-        <w:tc>
-          <w:tcPr>
-            <w:tcW w:w="5184" w:type="dxa"/>
-          </w:tcPr>
-          <w:p>
-            <w:r>
-              <w:t>72.5%</w:t>
-            </w:r>
-          </w:p>
-        </w:tc>
-      </w:tr>
-    </w:tbl>
     <w:p>
+      <w:pPr>
+        <w:spacing w:after="60"/>
+      </w:pPr>
       <w:r>
-        <w:t>The human and LLM judge had similar average overall scores, but only modest case-level agreement. Communication showed substantially stronger agreement than the other criteria. Therefore, the LLM judge is treated as a secondary evaluation signal rather than as a validated replacement for human judgement.</w:t>
+        <w:t>Human ratings used five criteria—correctness, relevance, grounding, actionability, and communication—plus an overall score, each on a 1–5 scale.</w:t>
+      </w:r>
+    </w:p>
+    <w:p>
+      <w:pPr>
+        <w:spacing w:after="60"/>
+      </w:pPr>
+      <w:r>
+        <w:t>Human overall mean: 4.175 / 5</w:t>
+      </w:r>
+    </w:p>
+    <w:p>
+      <w:pPr>
+        <w:spacing w:after="60"/>
+      </w:pPr>
+      <w:r>
+        <w:t>LLM judge overall mean: 4.150 / 5</w:t>
+      </w:r>
+    </w:p>
+    <w:p>
+      <w:pPr>
+        <w:spacing w:after="60"/>
+      </w:pPr>
+      <w:r>
+        <w:t>Overall exact human-vs-LLM agreement: 42.5%</w:t>
+      </w:r>
+    </w:p>
+    <w:p>
+      <w:pPr>
+        <w:spacing w:after="60"/>
+      </w:pPr>
+      <w:r>
+        <w:t>Overall agreement within one rating point: 72.5%</w:t>
+      </w:r>
+    </w:p>
+    <w:p>
+      <w:pPr>
+        <w:spacing w:after="60"/>
+      </w:pPr>
+      <w:r>
+        <w:t>Overall weighted Cohen's κ: 0.096</w:t>
+      </w:r>
+    </w:p>
+    <w:p>
+      <w:pPr>
+        <w:spacing w:after="60"/>
+      </w:pPr>
+      <w:r>
+        <w:t>Weighted Cohen's κ by criterion: Correctness 0.092; Relevance 0.243; Grounding 0.181; Actionability 0.079; Communication -0.071.</w:t>
+      </w:r>
+    </w:p>
+    <w:p>
+      <w:pPr>
+        <w:spacing w:after="60"/>
+      </w:pPr>
+      <w:r>
+        <w:t>The human and LLM judge had similar average overall scores, but case-level agreement was modest. The LLM judge is therefore treated as a secondary evaluation signal rather than as ground truth.</w:t>
       </w:r>
     </w:p>
     <w:p>
@@ -532,15 +599,23 @@
     </w:p>
     <w:p>
       <w:r>
-        <w:t>The repository includes pinned dependencies, a .</w:t>
+        <w:t xml:space="preserve">The repository includes pinned dependencies, </w:t>
+      </w:r>
+      <w:proofErr w:type="gramStart"/>
+      <w:r>
+        <w:t>a .</w:t>
       </w:r>
       <w:proofErr w:type="spellStart"/>
       <w:r>
         <w:t>gitignore</w:t>
       </w:r>
       <w:proofErr w:type="spellEnd"/>
+      <w:proofErr w:type="gramEnd"/>
       <w:r>
         <w:t>, a README with installation and evaluation instructions, checkpoint-safe evaluation code, stored evaluation artifacts, and a small interactive CLI demo. The final request path uses one LLM call per request and avoids a vector database, fine-tuning, a complex agent framework, and repeated tuning against the held-out test set.</w:t>
+      </w:r>
+      <w:r>
+        <w:t xml:space="preserve"> The README also contains the complete 15-item decision log documenting the project's non-obvious design choices.</w:t>
       </w:r>
     </w:p>
     <w:p>
@@ -550,9 +625,18 @@
     </w:p>
     <w:p>
       <w:pPr>
+        <w:spacing w:after="200"/>
+      </w:pPr>
+      <w:r>
+        <w:br w:type="page"/>
+      </w:r>
+    </w:p>
+    <w:p>
+      <w:pPr>
         <w:pStyle w:val="Heading1"/>
       </w:pPr>
       <w:r>
+        <w:lastRenderedPageBreak/>
         <w:t>9. Limitations and Conclusion</w:t>
       </w:r>
     </w:p>
@@ -563,7 +647,7 @@
     </w:p>
     <w:p>
       <w:r>
-        <w:t>If another week were available, the next improvements would focus on the observed failure modes rather than increasing system complexity: improve handling of short follow-up messages using conversation context, strengthen the distinction between FEATURE_OR_UI and CONTENT_OR_CATALOG, improve retrieval for sparse messages, and add a small development-only calibration study for retrieval and prompt behavior. The held-out test set would remain frozen during this work.</w:t>
+        <w:t>If another week were available, the next improvements would focus on the observed failure modes rather than increasing system complexity: improve handling of short follow-up messages using conversation context, strengthen the distinction between FEATURE_OR_UI and CONTENT_OR_CATALOG, improve retrieval for sparse messages, strengthen reply grounding, and expand evaluation. The held-out test set would remain frozen during this work.</w:t>
       </w:r>
     </w:p>
     <w:p>
@@ -577,11 +661,7 @@
         <w:jc w:val="center"/>
       </w:pPr>
       <w:r>
-        <w:rPr>
-          <w:b/>
-          <w:sz w:val="16"/>
-        </w:rPr>
-        <w:t>Key artifacts: README.md • requirements.txt • src/agent.py • src/demo.py • results/</w:t>
+        <w:t>Key artifacts: README.md • requirements.txt • src/agent.py • src/demo.py • src/evaluate_final_baselines.py • results/final_baseline_predictions.csv • results/agent_test_outputs.csv</w:t>
       </w:r>
     </w:p>
     <w:sectPr>

</xml_diff>